<commit_message>
Add 20 Newsgroups dataset; export PDFs; restructure report for two-dataset story
</commit_message>
<xml_diff>
--- a/manual.docx
+++ b/manual.docx
@@ -246,7 +246,7 @@
                 <w:rFonts w:ascii="Times New Roman" w:hAnsi="Times New Roman"/>
                 <w:sz w:val="18"/>
               </w:rPr>
-              <w:t>results/cv_results.csv</w:t>
+              <w:t>results/cv_synthetic.csv</w:t>
             </w:r>
           </w:p>
         </w:tc>
@@ -260,7 +260,7 @@
                 <w:rFonts w:ascii="Times New Roman" w:hAnsi="Times New Roman"/>
                 <w:sz w:val="18"/>
               </w:rPr>
-              <w:t>Per-fold CV scores (accuracy, macro-F1, MCC) for both classifiers</w:t>
+              <w:t>Per-fold CV scores on the synthetic corpus</w:t>
             </w:r>
           </w:p>
         </w:tc>
@@ -276,7 +276,7 @@
                 <w:rFonts w:ascii="Times New Roman" w:hAnsi="Times New Roman"/>
                 <w:sz w:val="18"/>
               </w:rPr>
-              <w:t>results/wilcoxon_results.csv</w:t>
+              <w:t>results/cv_20news.csv</w:t>
             </w:r>
           </w:p>
         </w:tc>
@@ -290,7 +290,7 @@
                 <w:rFonts w:ascii="Times New Roman" w:hAnsi="Times New Roman"/>
                 <w:sz w:val="18"/>
               </w:rPr>
-              <w:t>Wilcoxon W-statistic and p-value for each metric</w:t>
+              <w:t>Per-fold CV scores on 20 Newsgroups</w:t>
             </w:r>
           </w:p>
         </w:tc>
@@ -306,7 +306,7 @@
                 <w:rFonts w:ascii="Times New Roman" w:hAnsi="Times New Roman"/>
                 <w:sz w:val="18"/>
               </w:rPr>
-              <w:t>results/comparison_boxplot.png</w:t>
+              <w:t>results/wilcoxon.csv</w:t>
             </w:r>
           </w:p>
         </w:tc>
@@ -320,7 +320,7 @@
                 <w:rFonts w:ascii="Times New Roman" w:hAnsi="Times New Roman"/>
                 <w:sz w:val="18"/>
               </w:rPr>
-              <w:t>Boxplot of the 10-fold CV scores</w:t>
+              <w:t>Wilcoxon W and p-values for both datasets and all three metrics</w:t>
             </w:r>
           </w:p>
         </w:tc>
@@ -336,7 +336,7 @@
                 <w:rFonts w:ascii="Times New Roman" w:hAnsi="Times New Roman"/>
                 <w:sz w:val="18"/>
               </w:rPr>
-              <w:t>results/cm_baseline.png</w:t>
+              <w:t>results/timing.csv</w:t>
             </w:r>
           </w:p>
         </w:tc>
@@ -350,7 +350,7 @@
                 <w:rFonts w:ascii="Times New Roman" w:hAnsi="Times New Roman"/>
                 <w:sz w:val="18"/>
               </w:rPr>
-              <w:t>Confusion matrix for the baseline on the held-out test set</w:t>
+              <w:t>Fit and predict times plus held-out scores for both datasets</w:t>
             </w:r>
           </w:p>
         </w:tc>
@@ -366,7 +366,7 @@
                 <w:rFonts w:ascii="Times New Roman" w:hAnsi="Times New Roman"/>
                 <w:sz w:val="18"/>
               </w:rPr>
-              <w:t>results/cm_solution.png</w:t>
+              <w:t>results/ablation.csv</w:t>
             </w:r>
           </w:p>
         </w:tc>
@@ -380,7 +380,127 @@
                 <w:rFonts w:ascii="Times New Roman" w:hAnsi="Times New Roman"/>
                 <w:sz w:val="18"/>
               </w:rPr>
-              <w:t>Confusion matrix for the solution on the held-out test set</w:t>
+              <w:t>Feature-group contribution check on the synthetic corpus</w:t>
+            </w:r>
+          </w:p>
+        </w:tc>
+      </w:tr>
+      <w:tr>
+        <w:tc>
+          <w:tcPr>
+            <w:tcW w:type="dxa" w:w="4706"/>
+          </w:tcPr>
+          <w:p>
+            <w:r>
+              <w:rPr>
+                <w:rFonts w:ascii="Times New Roman" w:hAnsi="Times New Roman"/>
+                <w:sz w:val="18"/>
+              </w:rPr>
+              <w:t>results/boxplot_synthetic.png</w:t>
+            </w:r>
+          </w:p>
+        </w:tc>
+        <w:tc>
+          <w:tcPr>
+            <w:tcW w:type="dxa" w:w="4706"/>
+          </w:tcPr>
+          <w:p>
+            <w:r>
+              <w:rPr>
+                <w:rFonts w:ascii="Times New Roman" w:hAnsi="Times New Roman"/>
+                <w:sz w:val="18"/>
+              </w:rPr>
+              <w:t>Boxplot of 10-fold CV scores, synthetic</w:t>
+            </w:r>
+          </w:p>
+        </w:tc>
+      </w:tr>
+      <w:tr>
+        <w:tc>
+          <w:tcPr>
+            <w:tcW w:type="dxa" w:w="4706"/>
+          </w:tcPr>
+          <w:p>
+            <w:r>
+              <w:rPr>
+                <w:rFonts w:ascii="Times New Roman" w:hAnsi="Times New Roman"/>
+                <w:sz w:val="18"/>
+              </w:rPr>
+              <w:t>results/boxplot_20news.png</w:t>
+            </w:r>
+          </w:p>
+        </w:tc>
+        <w:tc>
+          <w:tcPr>
+            <w:tcW w:type="dxa" w:w="4706"/>
+          </w:tcPr>
+          <w:p>
+            <w:r>
+              <w:rPr>
+                <w:rFonts w:ascii="Times New Roman" w:hAnsi="Times New Roman"/>
+                <w:sz w:val="18"/>
+              </w:rPr>
+              <w:t>Boxplot of 10-fold CV scores, 20 Newsgroups</w:t>
+            </w:r>
+          </w:p>
+        </w:tc>
+      </w:tr>
+      <w:tr>
+        <w:tc>
+          <w:tcPr>
+            <w:tcW w:type="dxa" w:w="4706"/>
+          </w:tcPr>
+          <w:p>
+            <w:r>
+              <w:rPr>
+                <w:rFonts w:ascii="Times New Roman" w:hAnsi="Times New Roman"/>
+                <w:sz w:val="18"/>
+              </w:rPr>
+              <w:t>results/cm_synthetic_*.png</w:t>
+            </w:r>
+          </w:p>
+        </w:tc>
+        <w:tc>
+          <w:tcPr>
+            <w:tcW w:type="dxa" w:w="4706"/>
+          </w:tcPr>
+          <w:p>
+            <w:r>
+              <w:rPr>
+                <w:rFonts w:ascii="Times New Roman" w:hAnsi="Times New Roman"/>
+                <w:sz w:val="18"/>
+              </w:rPr>
+              <w:t>Confusion matrices on the synthetic held-out split</w:t>
+            </w:r>
+          </w:p>
+        </w:tc>
+      </w:tr>
+      <w:tr>
+        <w:tc>
+          <w:tcPr>
+            <w:tcW w:type="dxa" w:w="4706"/>
+          </w:tcPr>
+          <w:p>
+            <w:r>
+              <w:rPr>
+                <w:rFonts w:ascii="Times New Roman" w:hAnsi="Times New Roman"/>
+                <w:sz w:val="18"/>
+              </w:rPr>
+              <w:t>results/cm_20news_*.png</w:t>
+            </w:r>
+          </w:p>
+        </w:tc>
+        <w:tc>
+          <w:tcPr>
+            <w:tcW w:type="dxa" w:w="4706"/>
+          </w:tcPr>
+          <w:p>
+            <w:r>
+              <w:rPr>
+                <w:rFonts w:ascii="Times New Roman" w:hAnsi="Times New Roman"/>
+                <w:sz w:val="18"/>
+              </w:rPr>
+              <w:t>Confusion matrices on the 20 Newsgroups held-out split</w:t>
             </w:r>
           </w:p>
         </w:tc>
@@ -411,7 +531,7 @@
           <w:i w:val="0"/>
           <w:sz w:val="20"/>
         </w:rPr>
-        <w:t>About 30 to 60 seconds on a modern laptop. No GPU needed.</w:t>
+        <w:t>About 4 to 5 minutes on a modern laptop CPU; the bulk of the time is the Linear SVM fits on 20 Newsgroups. No GPU needed.</w:t>
       </w:r>
     </w:p>
     <w:sectPr>

</xml_diff>